<commit_message>
Merged PR 1160: fix(report-service): swap picture cant find picture
</commit_message>
<xml_diff>
--- a/tests/acceptance-tests/src/test/resources/ru/mycrg/acceptance/resources/reportsData/template to delete.docx
+++ b/tests/acceptance-tests/src/test/resources/ru/mycrg/acceptance/resources/reportsData/template to delete.docx
@@ -110,7 +110,7 @@
               <wp:inline xmlns:wp="http://schemas.openxmlformats.org/drawingml/2006/wordprocessingDrawing" distT="0" distB="0" distL="0" distR="0">
                 <wp:extent cx="5057775" cy="4257675"/>
                 <wp:effectExtent l="0" t="0" r="0" b="0"/>
-                <wp:docPr id="1" name="" descr="{%picture%}" title="{%picture%}"/>
+                <wp:docPr id="1" name="" descr="{%map%}" title=""/>
                 <wp:cNvGraphicFramePr>
                   <a:graphicFrameLocks xmlns:a="http://schemas.openxmlformats.org/drawingml/2006/main" noChangeAspect="1"/>
                 </wp:cNvGraphicFramePr>
@@ -118,7 +118,7 @@
                   <a:graphicData uri="http://schemas.openxmlformats.org/drawingml/2006/picture">
                     <pic:pic xmlns:pic="http://schemas.openxmlformats.org/drawingml/2006/picture">
                       <pic:nvPicPr>
-                        <pic:cNvPr id="884107684" name="" descr="{%picture%}" title="{%picture%}"/>
+                        <pic:cNvPr id="884107684" name="" descr="{%map%}"/>
                         <pic:cNvPicPr>
                           <a:picLocks noChangeAspect="1"/>
                         </pic:cNvPicPr>

</xml_diff>